<commit_message>
Split Lesson 3 homework into workbook then worksheet
The workbook now ends before the pupil writes anything. It keeps the
video, the three choices recap, the nine spot-it examples, the quiz and
the checklist, all unmarked practice, and finishes with a Google
Classroom button that takes him to the worksheet.

Removes the inline written work, the name field, the copy-out block and
the progress counter, plus the CSS and JS behind them. Ticks and quiz
answers still persist in localStorage so he can stop and come back.

The worksheet keeps the five written exercises and gains a line telling
him to do the workbook first.

Lesson and script updated to describe the two steps and why the order
matters.

Co-Authored-By: Claude Opus 5 <noreply@anthropic.com>
Claude-Session: https://claude.ai/code/session_013V4nARaiHdr3c9YRTN6Roe
</commit_message>
<xml_diff>
--- a/unit-1b-life-writing/lesson-03-claim-order-senses/Worksheet-3-Claim-Order-Senses.docx
+++ b/unit-1b-life-writing/lesson-03-claim-order-senses/Worksheet-3-Claim-Order-Senses.docx
@@ -104,6 +104,22 @@
           <w:szCs w:val="21"/>
         </w:rPr>
         <w:t xml:space="preserve">In our session we learned that everything in a piece of life writing can be completely true, and the writer still makes three choices that change how you feel about it.</w:t>
+      </w:r>
+    </w:p>
+    <w:p>
+      <w:pPr>
+        <w:spacing w:after="90" w:before="90"/>
+      </w:pPr>
+      <w:r>
+        <w:rPr>
+          <w:rFonts w:ascii="Calibri" w:cs="Calibri" w:eastAsia="Calibri" w:hAnsi="Calibri"/>
+          <w:i/>
+          <w:iCs/>
+          <w:color w:val="7A6450"/>
+          <w:sz w:val="21"/>
+          <w:szCs w:val="21"/>
+        </w:rPr>
+        <w:t xml:space="preserve">Do your Three Choices Workbook first. Watch the video, work through the practice and the quiz, and go through the checklist. This worksheet is the marked work, and it will be much quicker once you have done the workbook.</w:t>
       </w:r>
     </w:p>
     <w:p>

</xml_diff>